<commit_message>
ajout DSEQ 06 09 08 + modif FD 06 09
</commit_message>
<xml_diff>
--- a/Analyse/Fiches-descriptive/UC06-Gerer_les_affectations_du_materiel.docx
+++ b/Analyse/Fiches-descriptive/UC06-Gerer_les_affectations_du_materiel.docx
@@ -60,8 +60,6 @@
               </w:rPr>
               <w:t>06</w:t>
             </w:r>
-            <w:bookmarkStart w:id="0" w:name="_GoBack"/>
-            <w:bookmarkEnd w:id="0"/>
             <w:r>
               <w:rPr>
                 <w:rFonts w:ascii="Arial" w:hAnsi="Arial" w:cs="Arial"/>
@@ -963,27 +961,14 @@
       <w:r>
         <w:t xml:space="preserve">Figure </w:t>
       </w:r>
-      <w:r>
-        <w:fldChar w:fldCharType="begin"/>
-      </w:r>
-      <w:r>
-        <w:instrText xml:space="preserve"> SEQ Figure \* ARABIC </w:instrText>
-      </w:r>
-      <w:r>
-        <w:fldChar w:fldCharType="separate"/>
-      </w:r>
-      <w:r>
-        <w:rPr>
-          <w:noProof/>
-        </w:rPr>
-        <w:t>1</w:t>
-      </w:r>
-      <w:r>
-        <w:rPr>
-          <w:noProof/>
-        </w:rPr>
-        <w:fldChar w:fldCharType="end"/>
-      </w:r>
+      <w:fldSimple w:instr=" SEQ Figure \* ARABIC ">
+        <w:r>
+          <w:rPr>
+            <w:noProof/>
+          </w:rPr>
+          <w:t>1</w:t>
+        </w:r>
+      </w:fldSimple>
       <w:r>
         <w:t xml:space="preserve">: Page </w:t>
       </w:r>
@@ -1002,9 +987,9 @@
         <w:lastRenderedPageBreak/>
         <w:drawing>
           <wp:inline distT="0" distB="0" distL="0" distR="0">
-            <wp:extent cx="5760720" cy="2840990"/>
+            <wp:extent cx="5760720" cy="2842895"/>
             <wp:effectExtent l="0" t="0" r="0" b="0"/>
-            <wp:docPr id="4" name="Image 4"/>
+            <wp:docPr id="1" name="Image 1"/>
             <wp:cNvGraphicFramePr>
               <a:graphicFrameLocks xmlns:a="http://schemas.openxmlformats.org/drawingml/2006/main" noChangeAspect="1"/>
             </wp:cNvGraphicFramePr>
@@ -1012,7 +997,7 @@
               <a:graphicData uri="http://schemas.openxmlformats.org/drawingml/2006/picture">
                 <pic:pic xmlns:pic="http://schemas.openxmlformats.org/drawingml/2006/picture">
                   <pic:nvPicPr>
-                    <pic:cNvPr id="4" name="transfert2.png"/>
+                    <pic:cNvPr id="1" name="transfert2.png"/>
                     <pic:cNvPicPr/>
                   </pic:nvPicPr>
                   <pic:blipFill>
@@ -1030,7 +1015,7 @@
                   <pic:spPr>
                     <a:xfrm>
                       <a:off x="0" y="0"/>
-                      <a:ext cx="5760720" cy="2840990"/>
+                      <a:ext cx="5760720" cy="2842895"/>
                     </a:xfrm>
                     <a:prstGeom prst="rect">
                       <a:avLst/>
@@ -1050,14 +1035,27 @@
       <w:r>
         <w:t xml:space="preserve">Figure </w:t>
       </w:r>
-      <w:fldSimple w:instr=" SEQ Figure \* ARABIC ">
-        <w:r>
-          <w:rPr>
-            <w:noProof/>
-          </w:rPr>
-          <w:t>2</w:t>
-        </w:r>
-      </w:fldSimple>
+      <w:r>
+        <w:fldChar w:fldCharType="begin"/>
+      </w:r>
+      <w:r>
+        <w:instrText xml:space="preserve"> SEQ Figure \* ARABIC </w:instrText>
+      </w:r>
+      <w:r>
+        <w:fldChar w:fldCharType="separate"/>
+      </w:r>
+      <w:r>
+        <w:rPr>
+          <w:noProof/>
+        </w:rPr>
+        <w:t>2</w:t>
+      </w:r>
+      <w:r>
+        <w:rPr>
+          <w:noProof/>
+        </w:rPr>
+        <w:fldChar w:fldCharType="end"/>
+      </w:r>
       <w:r>
         <w:t>: Pop-up Affecter du matériel avant choix de salle</w:t>
       </w:r>
@@ -1072,9 +1070,9 @@
         </w:rPr>
         <w:drawing>
           <wp:inline distT="0" distB="0" distL="0" distR="0">
-            <wp:extent cx="5760720" cy="2833370"/>
-            <wp:effectExtent l="0" t="0" r="0" b="5080"/>
-            <wp:docPr id="5" name="Image 5"/>
+            <wp:extent cx="5760720" cy="2836545"/>
+            <wp:effectExtent l="0" t="0" r="0" b="1905"/>
+            <wp:docPr id="2" name="Image 2"/>
             <wp:cNvGraphicFramePr>
               <a:graphicFrameLocks xmlns:a="http://schemas.openxmlformats.org/drawingml/2006/main" noChangeAspect="1"/>
             </wp:cNvGraphicFramePr>
@@ -1082,7 +1080,7 @@
               <a:graphicData uri="http://schemas.openxmlformats.org/drawingml/2006/picture">
                 <pic:pic xmlns:pic="http://schemas.openxmlformats.org/drawingml/2006/picture">
                   <pic:nvPicPr>
-                    <pic:cNvPr id="5" name="transfert3.png"/>
+                    <pic:cNvPr id="2" name="transfert3.png"/>
                     <pic:cNvPicPr/>
                   </pic:nvPicPr>
                   <pic:blipFill>
@@ -1100,7 +1098,7 @@
                   <pic:spPr>
                     <a:xfrm>
                       <a:off x="0" y="0"/>
-                      <a:ext cx="5760720" cy="2833370"/>
+                      <a:ext cx="5760720" cy="2836545"/>
                     </a:xfrm>
                     <a:prstGeom prst="rect">
                       <a:avLst/>
@@ -1120,14 +1118,27 @@
       <w:r>
         <w:t xml:space="preserve">Figure </w:t>
       </w:r>
-      <w:fldSimple w:instr=" SEQ Figure \* ARABIC ">
-        <w:r>
-          <w:rPr>
-            <w:noProof/>
-          </w:rPr>
-          <w:t>3</w:t>
-        </w:r>
-      </w:fldSimple>
+      <w:r>
+        <w:fldChar w:fldCharType="begin"/>
+      </w:r>
+      <w:r>
+        <w:instrText xml:space="preserve"> SEQ Figure \* ARABIC </w:instrText>
+      </w:r>
+      <w:r>
+        <w:fldChar w:fldCharType="separate"/>
+      </w:r>
+      <w:r>
+        <w:rPr>
+          <w:noProof/>
+        </w:rPr>
+        <w:t>3</w:t>
+      </w:r>
+      <w:r>
+        <w:rPr>
+          <w:noProof/>
+        </w:rPr>
+        <w:fldChar w:fldCharType="end"/>
+      </w:r>
       <w:r>
         <w:t>: Pop-up Affecter du matériel après un choix de salle</w:t>
       </w:r>
@@ -1144,6 +1155,8 @@
         </w:rPr>
         <w:br w:type="page"/>
       </w:r>
+      <w:bookmarkStart w:id="0" w:name="_GoBack"/>
+      <w:bookmarkEnd w:id="0"/>
     </w:p>
     <w:tbl>
       <w:tblPr>

</xml_diff>